<commit_message>
updated song and dream file for main branch
</commit_message>
<xml_diff>
--- a/dream.docx
+++ b/dream.docx
@@ -4,9 +4,28 @@
   <w:body>
     <w:p>
       <w:r>
-        <w:t>This is a Microsoft word document.</w:t>
+        <w:t xml:space="preserve">This is a Microsoft word document.  </w:t>
+      </w:r>
+      <w:r>
+        <w:rPr>
+          <w:color w:val="C00000"/>
+        </w:rPr>
+        <w:t xml:space="preserve">(This is a change – Version for branch </w:t>
+      </w:r>
+      <w:r>
+        <w:rPr>
+          <w:color w:val="C00000"/>
+        </w:rPr>
+        <w:t>main</w:t>
+      </w:r>
+      <w:r>
+        <w:rPr>
+          <w:color w:val="C00000"/>
+        </w:rPr>
+        <w:t>)</w:t>
       </w:r>
     </w:p>
+    <w:p/>
     <w:p>
       <w:r>
         <w:t>It will be treated as a binary file by Git.</w:t>

</xml_diff>

<commit_message>
update dream on main
</commit_message>
<xml_diff>
--- a/dream.docx
+++ b/dream.docx
@@ -16,7 +16,7 @@
         <w:rPr>
           <w:color w:val="C00000"/>
         </w:rPr>
-        <w:t>main</w:t>
+        <w:t>Main</w:t>
       </w:r>
       <w:r>
         <w:rPr>
@@ -337,31 +337,7 @@
           <w14:ligatures w14:val="none"/>
         </w:rPr>
         <w:br/>
-        <w:t xml:space="preserve">When they're </w:t>
-      </w:r>
-      <w:proofErr w:type="spellStart"/>
-      <w:r>
-        <w:rPr>
-          <w:rFonts w:ascii="Helvetica Neue" w:eastAsia="Times New Roman" w:hAnsi="Helvetica Neue" w:cs="Times New Roman"/>
-          <w:color w:val="1F1F1F"/>
-          <w:kern w:val="0"/>
-          <w:sz w:val="21"/>
-          <w:szCs w:val="21"/>
-          <w14:ligatures w14:val="none"/>
-        </w:rPr>
-        <w:t>messin</w:t>
-      </w:r>
-      <w:proofErr w:type="spellEnd"/>
-      <w:r>
-        <w:rPr>
-          <w:rFonts w:ascii="Helvetica Neue" w:eastAsia="Times New Roman" w:hAnsi="Helvetica Neue" w:cs="Times New Roman"/>
-          <w:color w:val="1F1F1F"/>
-          <w:kern w:val="0"/>
-          <w:sz w:val="21"/>
-          <w:szCs w:val="21"/>
-          <w14:ligatures w14:val="none"/>
-        </w:rPr>
-        <w:t>' with a dreamer</w:t>
+        <w:t>When they're messin' with a dreamer</w:t>
       </w:r>
       <w:r>
         <w:rPr>
@@ -409,54 +385,7 @@
           <w14:ligatures w14:val="none"/>
         </w:rPr>
         <w:br/>
-      </w:r>
-      <w:proofErr w:type="spellStart"/>
-      <w:r>
-        <w:rPr>
-          <w:rFonts w:ascii="Helvetica Neue" w:eastAsia="Times New Roman" w:hAnsi="Helvetica Neue" w:cs="Times New Roman"/>
-          <w:color w:val="1F1F1F"/>
-          <w:kern w:val="0"/>
-          <w:sz w:val="21"/>
-          <w:szCs w:val="21"/>
-          <w14:ligatures w14:val="none"/>
-        </w:rPr>
-        <w:t>'Cause</w:t>
-      </w:r>
-      <w:proofErr w:type="spellEnd"/>
-      <w:r>
-        <w:rPr>
-          <w:rFonts w:ascii="Helvetica Neue" w:eastAsia="Times New Roman" w:hAnsi="Helvetica Neue" w:cs="Times New Roman"/>
-          <w:color w:val="1F1F1F"/>
-          <w:kern w:val="0"/>
-          <w:sz w:val="21"/>
-          <w:szCs w:val="21"/>
-          <w14:ligatures w14:val="none"/>
-        </w:rPr>
-        <w:t xml:space="preserve"> I </w:t>
-      </w:r>
-      <w:proofErr w:type="spellStart"/>
-      <w:r>
-        <w:rPr>
-          <w:rFonts w:ascii="Helvetica Neue" w:eastAsia="Times New Roman" w:hAnsi="Helvetica Neue" w:cs="Times New Roman"/>
-          <w:color w:val="1F1F1F"/>
-          <w:kern w:val="0"/>
-          <w:sz w:val="21"/>
-          <w:szCs w:val="21"/>
-          <w14:ligatures w14:val="none"/>
-        </w:rPr>
-        <w:t>ain't</w:t>
-      </w:r>
-      <w:proofErr w:type="spellEnd"/>
-      <w:r>
-        <w:rPr>
-          <w:rFonts w:ascii="Helvetica Neue" w:eastAsia="Times New Roman" w:hAnsi="Helvetica Neue" w:cs="Times New Roman"/>
-          <w:color w:val="1F1F1F"/>
-          <w:kern w:val="0"/>
-          <w:sz w:val="21"/>
-          <w:szCs w:val="21"/>
-          <w14:ligatures w14:val="none"/>
-        </w:rPr>
-        <w:t xml:space="preserve"> the way you found me</w:t>
+        <w:t>'Cause I ain't the way you found me</w:t>
       </w:r>
       <w:r>
         <w:rPr>

</xml_diff>

<commit_message>
forced change on main
</commit_message>
<xml_diff>
--- a/dream.docx
+++ b/dream.docx
@@ -16,7 +16,13 @@
         <w:rPr>
           <w:color w:val="C00000"/>
         </w:rPr>
-        <w:t>Main</w:t>
+        <w:t>M</w:t>
+      </w:r>
+      <w:r>
+        <w:rPr>
+          <w:color w:val="C00000"/>
+        </w:rPr>
+        <w:t>AIN</w:t>
       </w:r>
       <w:r>
         <w:rPr>

</xml_diff>

<commit_message>
forced change on alternative
</commit_message>
<xml_diff>
--- a/dream.docx
+++ b/dream.docx
@@ -10,7 +10,31 @@
         <w:rPr>
           <w:color w:val="C00000"/>
         </w:rPr>
-        <w:t>(This is a change – Version for branch alternate)</w:t>
+        <w:t xml:space="preserve">(This is a change – Version for branch </w:t>
+      </w:r>
+      <w:r>
+        <w:rPr>
+          <w:color w:val="C00000"/>
+        </w:rPr>
+        <w:t>A</w:t>
+      </w:r>
+      <w:r>
+        <w:rPr>
+          <w:color w:val="C00000"/>
+        </w:rPr>
+        <w:t>l</w:t>
+      </w:r>
+      <w:r>
+        <w:rPr>
+          <w:color w:val="C00000"/>
+        </w:rPr>
+        <w:t>TERNATE</w:t>
+      </w:r>
+      <w:r>
+        <w:rPr>
+          <w:color w:val="C00000"/>
+        </w:rPr>
+        <w:t>)</w:t>
       </w:r>
     </w:p>
     <w:p/>
@@ -325,31 +349,7 @@
           <w14:ligatures w14:val="none"/>
         </w:rPr>
         <w:br/>
-        <w:t xml:space="preserve">When they're </w:t>
-      </w:r>
-      <w:proofErr w:type="spellStart"/>
-      <w:r>
-        <w:rPr>
-          <w:rFonts w:ascii="Helvetica Neue" w:eastAsia="Times New Roman" w:hAnsi="Helvetica Neue" w:cs="Times New Roman"/>
-          <w:color w:val="1F1F1F"/>
-          <w:kern w:val="0"/>
-          <w:sz w:val="21"/>
-          <w:szCs w:val="21"/>
-          <w14:ligatures w14:val="none"/>
-        </w:rPr>
-        <w:t>messin</w:t>
-      </w:r>
-      <w:proofErr w:type="spellEnd"/>
-      <w:r>
-        <w:rPr>
-          <w:rFonts w:ascii="Helvetica Neue" w:eastAsia="Times New Roman" w:hAnsi="Helvetica Neue" w:cs="Times New Roman"/>
-          <w:color w:val="1F1F1F"/>
-          <w:kern w:val="0"/>
-          <w:sz w:val="21"/>
-          <w:szCs w:val="21"/>
-          <w14:ligatures w14:val="none"/>
-        </w:rPr>
-        <w:t>' with a dreamer</w:t>
+        <w:t>When they're messin' with a dreamer</w:t>
       </w:r>
       <w:r>
         <w:rPr>
@@ -397,54 +397,7 @@
           <w14:ligatures w14:val="none"/>
         </w:rPr>
         <w:br/>
-      </w:r>
-      <w:proofErr w:type="spellStart"/>
-      <w:r>
-        <w:rPr>
-          <w:rFonts w:ascii="Helvetica Neue" w:eastAsia="Times New Roman" w:hAnsi="Helvetica Neue" w:cs="Times New Roman"/>
-          <w:color w:val="1F1F1F"/>
-          <w:kern w:val="0"/>
-          <w:sz w:val="21"/>
-          <w:szCs w:val="21"/>
-          <w14:ligatures w14:val="none"/>
-        </w:rPr>
-        <w:t>'Cause</w:t>
-      </w:r>
-      <w:proofErr w:type="spellEnd"/>
-      <w:r>
-        <w:rPr>
-          <w:rFonts w:ascii="Helvetica Neue" w:eastAsia="Times New Roman" w:hAnsi="Helvetica Neue" w:cs="Times New Roman"/>
-          <w:color w:val="1F1F1F"/>
-          <w:kern w:val="0"/>
-          <w:sz w:val="21"/>
-          <w:szCs w:val="21"/>
-          <w14:ligatures w14:val="none"/>
-        </w:rPr>
-        <w:t xml:space="preserve"> I </w:t>
-      </w:r>
-      <w:proofErr w:type="spellStart"/>
-      <w:r>
-        <w:rPr>
-          <w:rFonts w:ascii="Helvetica Neue" w:eastAsia="Times New Roman" w:hAnsi="Helvetica Neue" w:cs="Times New Roman"/>
-          <w:color w:val="1F1F1F"/>
-          <w:kern w:val="0"/>
-          <w:sz w:val="21"/>
-          <w:szCs w:val="21"/>
-          <w14:ligatures w14:val="none"/>
-        </w:rPr>
-        <w:t>ain't</w:t>
-      </w:r>
-      <w:proofErr w:type="spellEnd"/>
-      <w:r>
-        <w:rPr>
-          <w:rFonts w:ascii="Helvetica Neue" w:eastAsia="Times New Roman" w:hAnsi="Helvetica Neue" w:cs="Times New Roman"/>
-          <w:color w:val="1F1F1F"/>
-          <w:kern w:val="0"/>
-          <w:sz w:val="21"/>
-          <w:szCs w:val="21"/>
-          <w14:ligatures w14:val="none"/>
-        </w:rPr>
-        <w:t xml:space="preserve"> the way you found me</w:t>
+        <w:t>'Cause I ain't the way you found me</w:t>
       </w:r>
       <w:r>
         <w:rPr>

</xml_diff>